<commit_message>
Completed Module 1 Assignment
</commit_message>
<xml_diff>
--- a/module-4/PedroAvila_CSD325_Flowcharts.docx
+++ b/module-4/PedroAvila_CSD325_Flowcharts.docx
@@ -71,6 +71,92 @@
                     <a:xfrm>
                       <a:off x="0" y="0"/>
                       <a:ext cx="4589429" cy="6257537"/>
+                    </a:xfrm>
+                    <a:prstGeom prst="rect">
+                      <a:avLst/>
+                    </a:prstGeom>
+                    <a:noFill/>
+                    <a:ln>
+                      <a:noFill/>
+                    </a:ln>
+                    <a:extLst>
+                      <a:ext uri="{53640926-AAD7-44D8-BBD7-CCE9431645EC}">
+                        <a14:shadowObscured xmlns:a14="http://schemas.microsoft.com/office/drawing/2010/main"/>
+                      </a:ext>
+                    </a:extLst>
+                  </pic:spPr>
+                </pic:pic>
+              </a:graphicData>
+            </a:graphic>
+          </wp:inline>
+        </w:drawing>
+      </w:r>
+      <w:r>
+        <w:fldChar w:fldCharType="end"/>
+      </w:r>
+    </w:p>
+    <w:p/>
+    <w:p>
+      <w:r>
+        <w:lastRenderedPageBreak/>
+        <w:t>Revised Sitka High/Low Flowchart</w:t>
+      </w:r>
+    </w:p>
+    <w:p>
+      <w:pPr>
+        <w:rPr>
+          <w:rFonts w:ascii="Arial" w:hAnsi="Arial" w:cs="Arial"/>
+          <w:sz w:val="16"/>
+          <w:szCs w:val="16"/>
+        </w:rPr>
+      </w:pPr>
+      <w:r>
+        <w:fldChar w:fldCharType="begin"/>
+      </w:r>
+      <w:r>
+        <w:instrText xml:space="preserve"> INCLUDEPICTURE "/Users/peyo/Library/Group Containers/UBF8T346G9.ms/WebArchiveCopyPasteTempFiles/com.microsoft.Word/content?id=file_000000008d8881f588e967267393cb8b&amp;ts=497547&amp;p=fs&amp;cid=1&amp;sig=f3bf40e0d75e45c8e2c686a00a4980527b80d0bd4656751e8b8cde5cf49c912f&amp;v=0" \* MERGEFORMATINET </w:instrText>
+      </w:r>
+      <w:r>
+        <w:fldChar w:fldCharType="separate"/>
+      </w:r>
+      <w:r>
+        <w:rPr>
+          <w:noProof/>
+        </w:rPr>
+        <w:drawing>
+          <wp:inline distT="0" distB="0" distL="0" distR="0" wp14:anchorId="193CA604" wp14:editId="74439051">
+            <wp:extent cx="4429060" cy="5546302"/>
+            <wp:effectExtent l="0" t="0" r="3810" b="3810"/>
+            <wp:docPr id="1684921771" name="Picture 1" descr="Weather Data Program Flowchart"/>
+            <wp:cNvGraphicFramePr>
+              <a:graphicFrameLocks xmlns:a="http://schemas.openxmlformats.org/drawingml/2006/main" noChangeAspect="1"/>
+            </wp:cNvGraphicFramePr>
+            <a:graphic xmlns:a="http://schemas.openxmlformats.org/drawingml/2006/main">
+              <a:graphicData uri="http://schemas.openxmlformats.org/drawingml/2006/picture">
+                <pic:pic xmlns:pic="http://schemas.openxmlformats.org/drawingml/2006/picture">
+                  <pic:nvPicPr>
+                    <pic:cNvPr id="0" name="Picture 1" descr="Weather Data Program Flowchart"/>
+                    <pic:cNvPicPr>
+                      <a:picLocks noChangeAspect="1" noChangeArrowheads="1"/>
+                    </pic:cNvPicPr>
+                  </pic:nvPicPr>
+                  <pic:blipFill rotWithShape="1">
+                    <a:blip r:embed="rId7">
+                      <a:extLst>
+                        <a:ext uri="{28A0092B-C50C-407E-A947-70E740481C1C}">
+                          <a14:useLocalDpi xmlns:a14="http://schemas.microsoft.com/office/drawing/2010/main" val="0"/>
+                        </a:ext>
+                      </a:extLst>
+                    </a:blip>
+                    <a:srcRect t="9181"/>
+                    <a:stretch>
+                      <a:fillRect/>
+                    </a:stretch>
+                  </pic:blipFill>
+                  <pic:spPr bwMode="auto">
+                    <a:xfrm>
+                      <a:off x="0" y="0"/>
+                      <a:ext cx="4460728" cy="5585958"/>
                     </a:xfrm>
                     <a:prstGeom prst="rect">
                       <a:avLst/>

</xml_diff>